<commit_message>
updated the Github Action instructions
</commit_message>
<xml_diff>
--- a/DevOps-Frasers/C#_app_with_GitHub_Actions.docx
+++ b/DevOps-Frasers/C#_app_with_GitHub_Actions.docx
@@ -61,10 +61,7 @@
         <w:t xml:space="preserve">build a </w:t>
       </w:r>
       <w:r>
-        <w:t>realistic</w:t>
-      </w:r>
-      <w:r>
-        <w:t xml:space="preserve"> </w:t>
+        <w:t xml:space="preserve">realistic </w:t>
       </w:r>
       <w:r>
         <w:t xml:space="preserve">small C# console app that calculates monthly subscription revenue metrics. </w:t>
@@ -408,6 +405,13 @@
         </w:rPr>
         <w:t>Git</w:t>
       </w:r>
+      <w:r>
+        <w:rPr>
+          <w:b/>
+          <w:bCs/>
+        </w:rPr>
+        <w:t xml:space="preserve"> CLI</w:t>
+      </w:r>
     </w:p>
     <w:p>
       <w:pPr>
@@ -424,7 +428,13 @@
         <w:t>Editor/IDE:</w:t>
       </w:r>
       <w:r>
-        <w:t xml:space="preserve"> Visual Studio, VS Code, or Rider</w:t>
+        <w:t xml:space="preserve"> Visual Studio</w:t>
+      </w:r>
+      <w:r>
+        <w:t xml:space="preserve"> or</w:t>
+      </w:r>
+      <w:r>
+        <w:t xml:space="preserve"> VS Code</w:t>
       </w:r>
       <w:r>
         <w:br/>
@@ -488,8 +498,49 @@
           <w:b/>
           <w:bCs/>
         </w:rPr>
-        <w:t>Create a folder and initialize a solution</w:t>
-      </w:r>
+        <w:t xml:space="preserve">Create a folder and initialize a </w:t>
+      </w:r>
+      <w:r>
+        <w:rPr>
+          <w:b/>
+          <w:bCs/>
+        </w:rPr>
+        <w:t xml:space="preserve">Console </w:t>
+      </w:r>
+      <w:r>
+        <w:rPr>
+          <w:b/>
+          <w:bCs/>
+        </w:rPr>
+        <w:t>solution</w:t>
+      </w:r>
+      <w:r>
+        <w:rPr>
+          <w:b/>
+          <w:bCs/>
+        </w:rPr>
+        <w:t xml:space="preserve"> called </w:t>
+      </w:r>
+      <w:proofErr w:type="spellStart"/>
+      <w:r>
+        <w:rPr>
+          <w:rFonts w:ascii="Courier New" w:hAnsi="Courier New" w:cs="Courier New"/>
+          <w:b/>
+          <w:bCs/>
+          <w:color w:val="77206D" w:themeColor="accent5" w:themeShade="BF"/>
+        </w:rPr>
+        <w:t>SubscriptionMetrics</w:t>
+      </w:r>
+      <w:r>
+        <w:rPr>
+          <w:rFonts w:ascii="Courier New" w:hAnsi="Courier New" w:cs="Courier New"/>
+          <w:b/>
+          <w:bCs/>
+          <w:color w:val="77206D" w:themeColor="accent5" w:themeShade="BF"/>
+        </w:rPr>
+        <w:t>.App</w:t>
+      </w:r>
+      <w:proofErr w:type="spellEnd"/>
     </w:p>
     <w:p>
       <w:pPr>
@@ -758,6 +809,8 @@
           <w:rFonts w:ascii="Courier New" w:hAnsi="Courier New" w:cs="Courier New"/>
           <w:b/>
           <w:bCs/>
+          <w:sz w:val="16"/>
+          <w:szCs w:val="16"/>
         </w:rPr>
         <w:t>SubscriptionMetrics.App</w:t>
       </w:r>
@@ -767,6 +820,8 @@
           <w:rFonts w:ascii="Courier New" w:hAnsi="Courier New" w:cs="Courier New"/>
           <w:b/>
           <w:bCs/>
+          <w:sz w:val="16"/>
+          <w:szCs w:val="16"/>
         </w:rPr>
         <w:t>/</w:t>
       </w:r>
@@ -776,6 +831,8 @@
           <w:rFonts w:ascii="Courier New" w:hAnsi="Courier New" w:cs="Courier New"/>
           <w:b/>
           <w:bCs/>
+          <w:sz w:val="16"/>
+          <w:szCs w:val="16"/>
         </w:rPr>
         <w:t>SubscriptionMetrics.App.csproj</w:t>
       </w:r>
@@ -879,12 +936,17 @@
     <w:p>
       <w:pPr>
         <w:ind w:left="1440"/>
-      </w:pPr>
-      <w:r>
         <w:rPr>
           <w:rFonts w:ascii="Courier New" w:hAnsi="Courier New" w:cs="Courier New"/>
           <w:b/>
           <w:bCs/>
+        </w:rPr>
+      </w:pPr>
+      <w:r>
+        <w:rPr>
+          <w:rFonts w:ascii="Courier New" w:hAnsi="Courier New" w:cs="Courier New"/>
+          <w:b/>
+          <w:bCs/>
           <w:color w:val="0070C0"/>
         </w:rPr>
         <w:t xml:space="preserve">cd </w:t>
@@ -896,6 +958,28 @@
           <w:bCs/>
         </w:rPr>
         <w:t>..</w:t>
+      </w:r>
+    </w:p>
+    <w:p>
+      <w:pPr>
+        <w:ind w:left="1440"/>
+      </w:pPr>
+      <w:r>
+        <w:rPr>
+          <w:rFonts w:ascii="Courier New" w:hAnsi="Courier New" w:cs="Courier New"/>
+          <w:b/>
+          <w:bCs/>
+          <w:color w:val="000000" w:themeColor="text1"/>
+        </w:rPr>
+        <w:t>open the folder in vs-</w:t>
+      </w:r>
+      <w:r>
+        <w:rPr>
+          <w:rFonts w:ascii="Courier New" w:hAnsi="Courier New" w:cs="Courier New"/>
+          <w:b/>
+          <w:bCs/>
+        </w:rPr>
+        <w:t>code or Visual studio.</w:t>
       </w:r>
       <w:r>
         <w:rPr>
@@ -946,13 +1030,29 @@
         </w:rPr>
         <w:t>Define the domain model</w:t>
       </w:r>
-    </w:p>
-    <w:p>
-      <w:pPr>
-        <w:ind w:left="720"/>
-      </w:pPr>
-    </w:p>
-    <w:p>
+      <w:r>
+        <w:rPr>
+          <w:b/>
+          <w:bCs/>
+        </w:rPr>
+        <w:t xml:space="preserve"> by creating a new files called </w:t>
+      </w:r>
+      <w:proofErr w:type="spellStart"/>
+      <w:r>
+        <w:rPr>
+          <w:b/>
+          <w:bCs/>
+          <w:color w:val="77206D" w:themeColor="accent5" w:themeShade="BF"/>
+        </w:rPr>
+        <w:t>CustomerSubscription.cs</w:t>
+      </w:r>
+      <w:proofErr w:type="spellEnd"/>
+      <w:r>
+        <w:t xml:space="preserve"> </w:t>
+      </w:r>
+      <w:r>
+        <w:br/>
+      </w:r>
       <w:r>
         <w:t xml:space="preserve">In </w:t>
       </w:r>
@@ -3248,6 +3348,7 @@
         <w:rPr>
           <w:b/>
           <w:bCs/>
+          <w:color w:val="77206D" w:themeColor="accent5" w:themeShade="BF"/>
         </w:rPr>
         <w:t>SubscriptionMetrics.App</w:t>
       </w:r>
@@ -3256,6 +3357,7 @@
         <w:rPr>
           <w:b/>
           <w:bCs/>
+          <w:color w:val="77206D" w:themeColor="accent5" w:themeShade="BF"/>
         </w:rPr>
         <w:t>/</w:t>
       </w:r>
@@ -3264,6 +3366,7 @@
         <w:rPr>
           <w:b/>
           <w:bCs/>
+          <w:color w:val="77206D" w:themeColor="accent5" w:themeShade="BF"/>
         </w:rPr>
         <w:t>RevenueCalculator.cs</w:t>
       </w:r>
@@ -4691,18 +4794,7 @@
           <w:highlight w:val="white"/>
           <w:lang w:eastAsia="en-US"/>
         </w:rPr>
-        <w:t>&gt;</w:t>
-      </w:r>
-      <w:r>
-        <w:rPr>
-          <w:rFonts w:ascii="Cascadia Mono" w:hAnsi="Cascadia Mono" w:cs="Cascadia Mono"/>
-          <w:color w:val="000000"/>
-          <w:sz w:val="19"/>
-          <w:szCs w:val="19"/>
-          <w:highlight w:val="white"/>
-          <w:lang w:eastAsia="en-US"/>
-        </w:rPr>
-        <w:t xml:space="preserve"> </w:t>
+        <w:t xml:space="preserve">&gt; </w:t>
       </w:r>
       <w:proofErr w:type="spellStart"/>
       <w:r>
@@ -5789,6 +5881,7 @@
         <w:rPr>
           <w:b/>
           <w:bCs/>
+          <w:color w:val="77206D" w:themeColor="accent5" w:themeShade="BF"/>
         </w:rPr>
         <w:t>Program.cs</w:t>
       </w:r>
@@ -8039,19 +8132,32 @@
           <w:b/>
           <w:bCs/>
         </w:rPr>
-        <w:t>Command:</w:t>
-      </w:r>
-      <w:r>
+        <w:t>Command</w:t>
+      </w:r>
+      <w:r>
+        <w:rPr>
+          <w:b/>
+          <w:bCs/>
+        </w:rPr>
         <w:t xml:space="preserve"> </w:t>
       </w:r>
+      <w:r>
+        <w:t>(all as one line)</w:t>
+      </w:r>
+      <w:r>
+        <w:rPr>
+          <w:b/>
+          <w:bCs/>
+        </w:rPr>
+        <w:t>:</w:t>
+      </w:r>
+      <w:r>
+        <w:t xml:space="preserve"> </w:t>
+      </w:r>
     </w:p>
     <w:p>
       <w:pPr>
         <w:ind w:left="1080"/>
-        <w:rPr>
-          <w:sz w:val="24"/>
-          <w:szCs w:val="24"/>
-        </w:rPr>
       </w:pPr>
       <w:r>
         <w:rPr>
@@ -8109,27 +8215,15 @@
           <w:sz w:val="24"/>
           <w:szCs w:val="24"/>
         </w:rPr>
-        <w:t xml:space="preserve"> \</w:t>
-      </w:r>
-    </w:p>
-    <w:p>
-      <w:pPr>
-        <w:ind w:left="1080"/>
-      </w:pPr>
+        <w:t xml:space="preserve"> reference S</w:t>
+      </w:r>
+      <w:proofErr w:type="spellStart"/>
       <w:r>
         <w:rPr>
           <w:sz w:val="24"/>
           <w:szCs w:val="24"/>
         </w:rPr>
-        <w:t xml:space="preserve">  reference </w:t>
-      </w:r>
-      <w:proofErr w:type="spellStart"/>
-      <w:r>
-        <w:rPr>
-          <w:sz w:val="24"/>
-          <w:szCs w:val="24"/>
-        </w:rPr>
-        <w:t>SubscriptionMetrics.App</w:t>
+        <w:t>ubscriptionMetrics.App</w:t>
       </w:r>
       <w:proofErr w:type="spellEnd"/>
       <w:r>
@@ -8605,31 +8699,7 @@
           <w:highlight w:val="white"/>
           <w:lang w:eastAsia="en-US"/>
         </w:rPr>
-        <w:t xml:space="preserve"> </w:t>
-      </w:r>
-      <w:proofErr w:type="spellStart"/>
-      <w:r>
-        <w:rPr>
-          <w:rFonts w:ascii="Cascadia Mono" w:hAnsi="Cascadia Mono" w:cs="Cascadia Mono"/>
-          <w:color w:val="000000"/>
-          <w:sz w:val="19"/>
-          <w:szCs w:val="19"/>
-          <w:highlight w:val="white"/>
-          <w:lang w:eastAsia="en-US"/>
-        </w:rPr>
-        <w:t>Calculate_ReturnsCorrectActiveMrrAndChurn</w:t>
-      </w:r>
-      <w:proofErr w:type="spellEnd"/>
-      <w:r>
-        <w:rPr>
-          <w:rFonts w:ascii="Cascadia Mono" w:hAnsi="Cascadia Mono" w:cs="Cascadia Mono"/>
-          <w:color w:val="000000"/>
-          <w:sz w:val="19"/>
-          <w:szCs w:val="19"/>
-          <w:highlight w:val="white"/>
-          <w:lang w:eastAsia="en-US"/>
-        </w:rPr>
-        <w:t>()</w:t>
+        <w:t xml:space="preserve"> Calculate_ReturnsCorrectActiveMrrAndChurn()</w:t>
       </w:r>
     </w:p>
     <w:p>
@@ -9888,7 +9958,29 @@
           <w:highlight w:val="white"/>
           <w:lang w:eastAsia="en-US"/>
         </w:rPr>
-        <w:t xml:space="preserve">(100m, </w:t>
+        <w:t>(</w:t>
+      </w:r>
+      <w:r>
+        <w:rPr>
+          <w:rFonts w:ascii="Cascadia Mono" w:hAnsi="Cascadia Mono" w:cs="Cascadia Mono"/>
+          <w:color w:val="000000"/>
+          <w:sz w:val="19"/>
+          <w:szCs w:val="19"/>
+          <w:highlight w:val="white"/>
+          <w:lang w:eastAsia="en-US"/>
+        </w:rPr>
+        <w:t>25</w:t>
+      </w:r>
+      <w:r>
+        <w:rPr>
+          <w:rFonts w:ascii="Cascadia Mono" w:hAnsi="Cascadia Mono" w:cs="Cascadia Mono"/>
+          <w:color w:val="000000"/>
+          <w:sz w:val="19"/>
+          <w:szCs w:val="19"/>
+          <w:highlight w:val="white"/>
+          <w:lang w:eastAsia="en-US"/>
+        </w:rPr>
+        <w:t xml:space="preserve">m, </w:t>
       </w:r>
       <w:proofErr w:type="spellStart"/>
       <w:r>
@@ -9974,7 +10066,29 @@
           <w:highlight w:val="white"/>
           <w:lang w:eastAsia="en-US"/>
         </w:rPr>
-        <w:t xml:space="preserve">(25m, </w:t>
+        <w:t>(</w:t>
+      </w:r>
+      <w:r>
+        <w:rPr>
+          <w:rFonts w:ascii="Cascadia Mono" w:hAnsi="Cascadia Mono" w:cs="Cascadia Mono"/>
+          <w:color w:val="000000"/>
+          <w:sz w:val="19"/>
+          <w:szCs w:val="19"/>
+          <w:highlight w:val="white"/>
+          <w:lang w:eastAsia="en-US"/>
+        </w:rPr>
+        <w:t>100</w:t>
+      </w:r>
+      <w:r>
+        <w:rPr>
+          <w:rFonts w:ascii="Cascadia Mono" w:hAnsi="Cascadia Mono" w:cs="Cascadia Mono"/>
+          <w:color w:val="000000"/>
+          <w:sz w:val="19"/>
+          <w:szCs w:val="19"/>
+          <w:highlight w:val="white"/>
+          <w:lang w:eastAsia="en-US"/>
+        </w:rPr>
+        <w:t xml:space="preserve">m, </w:t>
       </w:r>
       <w:proofErr w:type="spellStart"/>
       <w:r>
@@ -10617,7 +10731,18 @@
         </w:numPr>
       </w:pPr>
       <w:r>
-        <w:t>Create a new repository called subscription-metrics (or your naming convention).</w:t>
+        <w:t xml:space="preserve">Create a new repository called </w:t>
+      </w:r>
+      <w:r>
+        <w:rPr>
+          <w:b/>
+          <w:bCs/>
+          <w:color w:val="77206D" w:themeColor="accent5" w:themeShade="BF"/>
+        </w:rPr>
+        <w:t>subscription-metrics</w:t>
+      </w:r>
+      <w:r>
+        <w:t>.</w:t>
       </w:r>
     </w:p>
     <w:p>
@@ -13038,7 +13163,13 @@
         </w:numPr>
       </w:pPr>
       <w:r>
-        <w:t xml:space="preserve">On GitHub, go to </w:t>
+        <w:t xml:space="preserve">On GitHub, </w:t>
+      </w:r>
+      <w:r>
+        <w:t xml:space="preserve">open the repository and then </w:t>
+      </w:r>
+      <w:r>
+        <w:t xml:space="preserve">go to </w:t>
       </w:r>
       <w:r>
         <w:rPr>
@@ -13095,7 +13226,7 @@
         </w:numPr>
       </w:pPr>
       <w:r>
-        <w:t>Seeing the green check/red cross on the commit and PR</w:t>
+        <w:t>Seeing the check/red cross on the commit and PR</w:t>
       </w:r>
     </w:p>
     <w:p/>
@@ -13104,10 +13235,15 @@
         <w:pStyle w:val="Heading2"/>
       </w:pPr>
       <w:r>
+        <w:lastRenderedPageBreak/>
         <w:t xml:space="preserve">6. Part 4 – Extensions </w:t>
       </w:r>
     </w:p>
     <w:p>
+      <w:pPr>
+        <w:keepNext/>
+        <w:keepLines/>
+      </w:pPr>
       <w:r>
         <w:t xml:space="preserve">Use </w:t>
       </w:r>
@@ -13118,18 +13254,24 @@
         <w:t>as optional stretch goals.</w:t>
       </w:r>
     </w:p>
-    <w:p/>
+    <w:p>
+      <w:pPr>
+        <w:keepNext/>
+        <w:keepLines/>
+      </w:pPr>
+    </w:p>
     <w:p>
       <w:pPr>
         <w:pStyle w:val="Heading3"/>
       </w:pPr>
       <w:r>
-        <w:lastRenderedPageBreak/>
         <w:t>6.1 Add a build matrix (OS coverage)</w:t>
       </w:r>
     </w:p>
     <w:p>
       <w:pPr>
+        <w:keepNext/>
+        <w:keepLines/>
         <w:suppressAutoHyphens w:val="0"/>
         <w:autoSpaceDE w:val="0"/>
         <w:autoSpaceDN w:val="0"/>
@@ -13542,9 +13684,1366 @@
     </w:p>
     <w:p>
       <w:pPr>
-        <w:rPr>
-          <w:b/>
-          <w:bCs/>
+        <w:shd w:val="clear" w:color="auto" w:fill="FFFFFF"/>
+        <w:suppressAutoHyphens w:val="0"/>
+        <w:spacing w:line="285" w:lineRule="atLeast"/>
+        <w:rPr>
+          <w:b/>
+          <w:bCs/>
+        </w:rPr>
+      </w:pPr>
+    </w:p>
+    <w:p>
+      <w:pPr>
+        <w:shd w:val="clear" w:color="auto" w:fill="FFFFFF"/>
+        <w:suppressAutoHyphens w:val="0"/>
+        <w:spacing w:line="285" w:lineRule="atLeast"/>
+        <w:rPr>
+          <w:rFonts w:ascii="Consolas" w:eastAsia="Times New Roman" w:hAnsi="Consolas" w:cs="Times New Roman"/>
+          <w:color w:val="000000"/>
+          <w:sz w:val="21"/>
+          <w:szCs w:val="21"/>
+        </w:rPr>
+      </w:pPr>
+      <w:r>
+        <w:rPr>
+          <w:b/>
+          <w:bCs/>
+        </w:rPr>
+        <w:t xml:space="preserve">Here is a sample </w:t>
+      </w:r>
+      <w:proofErr w:type="spellStart"/>
+      <w:r>
+        <w:rPr>
+          <w:b/>
+          <w:bCs/>
+        </w:rPr>
+        <w:t>yaml</w:t>
+      </w:r>
+      <w:proofErr w:type="spellEnd"/>
+      <w:r>
+        <w:rPr>
+          <w:b/>
+          <w:bCs/>
+        </w:rPr>
+        <w:t xml:space="preserve"> file:</w:t>
+      </w:r>
+      <w:r>
+        <w:rPr>
+          <w:b/>
+          <w:bCs/>
+        </w:rPr>
+        <w:br/>
+      </w:r>
+      <w:r>
+        <w:rPr>
+          <w:rFonts w:ascii="Consolas" w:eastAsia="Times New Roman" w:hAnsi="Consolas" w:cs="Times New Roman"/>
+          <w:color w:val="800000"/>
+          <w:sz w:val="21"/>
+          <w:szCs w:val="21"/>
+        </w:rPr>
+        <w:t>name</w:t>
+      </w:r>
+      <w:r>
+        <w:rPr>
+          <w:rFonts w:ascii="Consolas" w:eastAsia="Times New Roman" w:hAnsi="Consolas" w:cs="Times New Roman"/>
+          <w:color w:val="000000"/>
+          <w:sz w:val="21"/>
+          <w:szCs w:val="21"/>
+        </w:rPr>
+        <w:t xml:space="preserve">: </w:t>
+      </w:r>
+      <w:r>
+        <w:rPr>
+          <w:rFonts w:ascii="Consolas" w:eastAsia="Times New Roman" w:hAnsi="Consolas" w:cs="Times New Roman"/>
+          <w:color w:val="0000FF"/>
+          <w:sz w:val="21"/>
+          <w:szCs w:val="21"/>
+        </w:rPr>
+        <w:t>.NET CI</w:t>
+      </w:r>
+    </w:p>
+    <w:p>
+      <w:pPr>
+        <w:shd w:val="clear" w:color="auto" w:fill="FFFFFF"/>
+        <w:suppressAutoHyphens w:val="0"/>
+        <w:spacing w:line="285" w:lineRule="atLeast"/>
+        <w:rPr>
+          <w:rFonts w:ascii="Consolas" w:eastAsia="Times New Roman" w:hAnsi="Consolas" w:cs="Times New Roman"/>
+          <w:color w:val="000000"/>
+          <w:sz w:val="21"/>
+          <w:szCs w:val="21"/>
+        </w:rPr>
+      </w:pPr>
+    </w:p>
+    <w:p>
+      <w:pPr>
+        <w:shd w:val="clear" w:color="auto" w:fill="FFFFFF"/>
+        <w:suppressAutoHyphens w:val="0"/>
+        <w:spacing w:line="285" w:lineRule="atLeast"/>
+        <w:rPr>
+          <w:rFonts w:ascii="Consolas" w:eastAsia="Times New Roman" w:hAnsi="Consolas" w:cs="Times New Roman"/>
+          <w:color w:val="000000"/>
+          <w:sz w:val="21"/>
+          <w:szCs w:val="21"/>
+        </w:rPr>
+      </w:pPr>
+      <w:r>
+        <w:rPr>
+          <w:rFonts w:ascii="Consolas" w:eastAsia="Times New Roman" w:hAnsi="Consolas" w:cs="Times New Roman"/>
+          <w:color w:val="0000FF"/>
+          <w:sz w:val="21"/>
+          <w:szCs w:val="21"/>
+        </w:rPr>
+        <w:t>on</w:t>
+      </w:r>
+      <w:r>
+        <w:rPr>
+          <w:rFonts w:ascii="Consolas" w:eastAsia="Times New Roman" w:hAnsi="Consolas" w:cs="Times New Roman"/>
+          <w:color w:val="000000"/>
+          <w:sz w:val="21"/>
+          <w:szCs w:val="21"/>
+        </w:rPr>
+        <w:t>:</w:t>
+      </w:r>
+    </w:p>
+    <w:p>
+      <w:pPr>
+        <w:shd w:val="clear" w:color="auto" w:fill="FFFFFF"/>
+        <w:suppressAutoHyphens w:val="0"/>
+        <w:spacing w:line="285" w:lineRule="atLeast"/>
+        <w:rPr>
+          <w:rFonts w:ascii="Consolas" w:eastAsia="Times New Roman" w:hAnsi="Consolas" w:cs="Times New Roman"/>
+          <w:color w:val="000000"/>
+          <w:sz w:val="21"/>
+          <w:szCs w:val="21"/>
+        </w:rPr>
+      </w:pPr>
+      <w:r>
+        <w:rPr>
+          <w:rFonts w:ascii="Consolas" w:eastAsia="Times New Roman" w:hAnsi="Consolas" w:cs="Times New Roman"/>
+          <w:color w:val="000000"/>
+          <w:sz w:val="21"/>
+          <w:szCs w:val="21"/>
+        </w:rPr>
+        <w:t xml:space="preserve">  </w:t>
+      </w:r>
+      <w:r>
+        <w:rPr>
+          <w:rFonts w:ascii="Consolas" w:eastAsia="Times New Roman" w:hAnsi="Consolas" w:cs="Times New Roman"/>
+          <w:color w:val="800000"/>
+          <w:sz w:val="21"/>
+          <w:szCs w:val="21"/>
+        </w:rPr>
+        <w:t>push</w:t>
+      </w:r>
+      <w:r>
+        <w:rPr>
+          <w:rFonts w:ascii="Consolas" w:eastAsia="Times New Roman" w:hAnsi="Consolas" w:cs="Times New Roman"/>
+          <w:color w:val="000000"/>
+          <w:sz w:val="21"/>
+          <w:szCs w:val="21"/>
+        </w:rPr>
+        <w:t>:</w:t>
+      </w:r>
+    </w:p>
+    <w:p>
+      <w:pPr>
+        <w:shd w:val="clear" w:color="auto" w:fill="FFFFFF"/>
+        <w:suppressAutoHyphens w:val="0"/>
+        <w:spacing w:line="285" w:lineRule="atLeast"/>
+        <w:rPr>
+          <w:rFonts w:ascii="Consolas" w:eastAsia="Times New Roman" w:hAnsi="Consolas" w:cs="Times New Roman"/>
+          <w:color w:val="000000"/>
+          <w:sz w:val="21"/>
+          <w:szCs w:val="21"/>
+        </w:rPr>
+      </w:pPr>
+      <w:r>
+        <w:rPr>
+          <w:rFonts w:ascii="Consolas" w:eastAsia="Times New Roman" w:hAnsi="Consolas" w:cs="Times New Roman"/>
+          <w:color w:val="000000"/>
+          <w:sz w:val="21"/>
+          <w:szCs w:val="21"/>
+        </w:rPr>
+        <w:t xml:space="preserve">    </w:t>
+      </w:r>
+      <w:r>
+        <w:rPr>
+          <w:rFonts w:ascii="Consolas" w:eastAsia="Times New Roman" w:hAnsi="Consolas" w:cs="Times New Roman"/>
+          <w:color w:val="800000"/>
+          <w:sz w:val="21"/>
+          <w:szCs w:val="21"/>
+        </w:rPr>
+        <w:t>branches</w:t>
+      </w:r>
+      <w:r>
+        <w:rPr>
+          <w:rFonts w:ascii="Consolas" w:eastAsia="Times New Roman" w:hAnsi="Consolas" w:cs="Times New Roman"/>
+          <w:color w:val="000000"/>
+          <w:sz w:val="21"/>
+          <w:szCs w:val="21"/>
+        </w:rPr>
+        <w:t xml:space="preserve">: [ </w:t>
+      </w:r>
+      <w:r>
+        <w:rPr>
+          <w:rFonts w:ascii="Consolas" w:eastAsia="Times New Roman" w:hAnsi="Consolas" w:cs="Times New Roman"/>
+          <w:color w:val="A31515"/>
+          <w:sz w:val="21"/>
+          <w:szCs w:val="21"/>
+        </w:rPr>
+        <w:t>"main"</w:t>
+      </w:r>
+      <w:r>
+        <w:rPr>
+          <w:rFonts w:ascii="Consolas" w:eastAsia="Times New Roman" w:hAnsi="Consolas" w:cs="Times New Roman"/>
+          <w:color w:val="000000"/>
+          <w:sz w:val="21"/>
+          <w:szCs w:val="21"/>
+        </w:rPr>
+        <w:t xml:space="preserve"> ]</w:t>
+      </w:r>
+    </w:p>
+    <w:p>
+      <w:pPr>
+        <w:shd w:val="clear" w:color="auto" w:fill="FFFFFF"/>
+        <w:suppressAutoHyphens w:val="0"/>
+        <w:spacing w:line="285" w:lineRule="atLeast"/>
+        <w:rPr>
+          <w:rFonts w:ascii="Consolas" w:eastAsia="Times New Roman" w:hAnsi="Consolas" w:cs="Times New Roman"/>
+          <w:color w:val="000000"/>
+          <w:sz w:val="21"/>
+          <w:szCs w:val="21"/>
+        </w:rPr>
+      </w:pPr>
+      <w:r>
+        <w:rPr>
+          <w:rFonts w:ascii="Consolas" w:eastAsia="Times New Roman" w:hAnsi="Consolas" w:cs="Times New Roman"/>
+          <w:color w:val="000000"/>
+          <w:sz w:val="21"/>
+          <w:szCs w:val="21"/>
+        </w:rPr>
+        <w:t xml:space="preserve">  </w:t>
+      </w:r>
+      <w:proofErr w:type="spellStart"/>
+      <w:r>
+        <w:rPr>
+          <w:rFonts w:ascii="Consolas" w:eastAsia="Times New Roman" w:hAnsi="Consolas" w:cs="Times New Roman"/>
+          <w:color w:val="800000"/>
+          <w:sz w:val="21"/>
+          <w:szCs w:val="21"/>
+        </w:rPr>
+        <w:t>pull_request</w:t>
+      </w:r>
+      <w:proofErr w:type="spellEnd"/>
+      <w:r>
+        <w:rPr>
+          <w:rFonts w:ascii="Consolas" w:eastAsia="Times New Roman" w:hAnsi="Consolas" w:cs="Times New Roman"/>
+          <w:color w:val="000000"/>
+          <w:sz w:val="21"/>
+          <w:szCs w:val="21"/>
+        </w:rPr>
+        <w:t>:</w:t>
+      </w:r>
+    </w:p>
+    <w:p>
+      <w:pPr>
+        <w:shd w:val="clear" w:color="auto" w:fill="FFFFFF"/>
+        <w:suppressAutoHyphens w:val="0"/>
+        <w:spacing w:line="285" w:lineRule="atLeast"/>
+        <w:rPr>
+          <w:rFonts w:ascii="Consolas" w:eastAsia="Times New Roman" w:hAnsi="Consolas" w:cs="Times New Roman"/>
+          <w:color w:val="000000"/>
+          <w:sz w:val="21"/>
+          <w:szCs w:val="21"/>
+        </w:rPr>
+      </w:pPr>
+      <w:r>
+        <w:rPr>
+          <w:rFonts w:ascii="Consolas" w:eastAsia="Times New Roman" w:hAnsi="Consolas" w:cs="Times New Roman"/>
+          <w:color w:val="000000"/>
+          <w:sz w:val="21"/>
+          <w:szCs w:val="21"/>
+        </w:rPr>
+        <w:t xml:space="preserve">    </w:t>
+      </w:r>
+      <w:r>
+        <w:rPr>
+          <w:rFonts w:ascii="Consolas" w:eastAsia="Times New Roman" w:hAnsi="Consolas" w:cs="Times New Roman"/>
+          <w:color w:val="800000"/>
+          <w:sz w:val="21"/>
+          <w:szCs w:val="21"/>
+        </w:rPr>
+        <w:t>branches</w:t>
+      </w:r>
+      <w:r>
+        <w:rPr>
+          <w:rFonts w:ascii="Consolas" w:eastAsia="Times New Roman" w:hAnsi="Consolas" w:cs="Times New Roman"/>
+          <w:color w:val="000000"/>
+          <w:sz w:val="21"/>
+          <w:szCs w:val="21"/>
+        </w:rPr>
+        <w:t xml:space="preserve">: [ </w:t>
+      </w:r>
+      <w:r>
+        <w:rPr>
+          <w:rFonts w:ascii="Consolas" w:eastAsia="Times New Roman" w:hAnsi="Consolas" w:cs="Times New Roman"/>
+          <w:color w:val="A31515"/>
+          <w:sz w:val="21"/>
+          <w:szCs w:val="21"/>
+        </w:rPr>
+        <w:t>"main"</w:t>
+      </w:r>
+      <w:r>
+        <w:rPr>
+          <w:rFonts w:ascii="Consolas" w:eastAsia="Times New Roman" w:hAnsi="Consolas" w:cs="Times New Roman"/>
+          <w:color w:val="000000"/>
+          <w:sz w:val="21"/>
+          <w:szCs w:val="21"/>
+        </w:rPr>
+        <w:t xml:space="preserve"> ]</w:t>
+      </w:r>
+    </w:p>
+    <w:p>
+      <w:pPr>
+        <w:shd w:val="clear" w:color="auto" w:fill="FFFFFF"/>
+        <w:suppressAutoHyphens w:val="0"/>
+        <w:spacing w:line="285" w:lineRule="atLeast"/>
+        <w:rPr>
+          <w:rFonts w:ascii="Consolas" w:eastAsia="Times New Roman" w:hAnsi="Consolas" w:cs="Times New Roman"/>
+          <w:color w:val="000000"/>
+          <w:sz w:val="21"/>
+          <w:szCs w:val="21"/>
+        </w:rPr>
+      </w:pPr>
+    </w:p>
+    <w:p>
+      <w:pPr>
+        <w:shd w:val="clear" w:color="auto" w:fill="FFFFFF"/>
+        <w:suppressAutoHyphens w:val="0"/>
+        <w:spacing w:line="285" w:lineRule="atLeast"/>
+        <w:rPr>
+          <w:rFonts w:ascii="Consolas" w:eastAsia="Times New Roman" w:hAnsi="Consolas" w:cs="Times New Roman"/>
+          <w:color w:val="000000"/>
+          <w:sz w:val="21"/>
+          <w:szCs w:val="21"/>
+        </w:rPr>
+      </w:pPr>
+      <w:r>
+        <w:rPr>
+          <w:rFonts w:ascii="Consolas" w:eastAsia="Times New Roman" w:hAnsi="Consolas" w:cs="Times New Roman"/>
+          <w:color w:val="800000"/>
+          <w:sz w:val="21"/>
+          <w:szCs w:val="21"/>
+        </w:rPr>
+        <w:t>jobs</w:t>
+      </w:r>
+      <w:r>
+        <w:rPr>
+          <w:rFonts w:ascii="Consolas" w:eastAsia="Times New Roman" w:hAnsi="Consolas" w:cs="Times New Roman"/>
+          <w:color w:val="000000"/>
+          <w:sz w:val="21"/>
+          <w:szCs w:val="21"/>
+        </w:rPr>
+        <w:t>:</w:t>
+      </w:r>
+    </w:p>
+    <w:p>
+      <w:pPr>
+        <w:shd w:val="clear" w:color="auto" w:fill="FFFFFF"/>
+        <w:suppressAutoHyphens w:val="0"/>
+        <w:spacing w:line="285" w:lineRule="atLeast"/>
+        <w:rPr>
+          <w:rFonts w:ascii="Consolas" w:eastAsia="Times New Roman" w:hAnsi="Consolas" w:cs="Times New Roman"/>
+          <w:color w:val="000000"/>
+          <w:sz w:val="21"/>
+          <w:szCs w:val="21"/>
+        </w:rPr>
+      </w:pPr>
+      <w:r>
+        <w:rPr>
+          <w:rFonts w:ascii="Consolas" w:eastAsia="Times New Roman" w:hAnsi="Consolas" w:cs="Times New Roman"/>
+          <w:color w:val="000000"/>
+          <w:sz w:val="21"/>
+          <w:szCs w:val="21"/>
+        </w:rPr>
+        <w:t xml:space="preserve">  </w:t>
+      </w:r>
+      <w:r>
+        <w:rPr>
+          <w:rFonts w:ascii="Consolas" w:eastAsia="Times New Roman" w:hAnsi="Consolas" w:cs="Times New Roman"/>
+          <w:color w:val="800000"/>
+          <w:sz w:val="21"/>
+          <w:szCs w:val="21"/>
+        </w:rPr>
+        <w:t>build-and-test</w:t>
+      </w:r>
+      <w:r>
+        <w:rPr>
+          <w:rFonts w:ascii="Consolas" w:eastAsia="Times New Roman" w:hAnsi="Consolas" w:cs="Times New Roman"/>
+          <w:color w:val="000000"/>
+          <w:sz w:val="21"/>
+          <w:szCs w:val="21"/>
+        </w:rPr>
+        <w:t>:</w:t>
+      </w:r>
+    </w:p>
+    <w:p>
+      <w:pPr>
+        <w:shd w:val="clear" w:color="auto" w:fill="FFFFFF"/>
+        <w:suppressAutoHyphens w:val="0"/>
+        <w:spacing w:line="285" w:lineRule="atLeast"/>
+        <w:rPr>
+          <w:rFonts w:ascii="Consolas" w:eastAsia="Times New Roman" w:hAnsi="Consolas" w:cs="Times New Roman"/>
+          <w:color w:val="000000"/>
+          <w:sz w:val="21"/>
+          <w:szCs w:val="21"/>
+        </w:rPr>
+      </w:pPr>
+      <w:r>
+        <w:rPr>
+          <w:rFonts w:ascii="Consolas" w:eastAsia="Times New Roman" w:hAnsi="Consolas" w:cs="Times New Roman"/>
+          <w:color w:val="000000"/>
+          <w:sz w:val="21"/>
+          <w:szCs w:val="21"/>
+        </w:rPr>
+        <w:t xml:space="preserve">    </w:t>
+      </w:r>
+      <w:r>
+        <w:rPr>
+          <w:rFonts w:ascii="Consolas" w:eastAsia="Times New Roman" w:hAnsi="Consolas" w:cs="Times New Roman"/>
+          <w:color w:val="800000"/>
+          <w:sz w:val="21"/>
+          <w:szCs w:val="21"/>
+        </w:rPr>
+        <w:t>runs-on</w:t>
+      </w:r>
+      <w:r>
+        <w:rPr>
+          <w:rFonts w:ascii="Consolas" w:eastAsia="Times New Roman" w:hAnsi="Consolas" w:cs="Times New Roman"/>
+          <w:color w:val="000000"/>
+          <w:sz w:val="21"/>
+          <w:szCs w:val="21"/>
+        </w:rPr>
+        <w:t xml:space="preserve">: ${{ </w:t>
+      </w:r>
+      <w:proofErr w:type="spellStart"/>
+      <w:r>
+        <w:rPr>
+          <w:rFonts w:ascii="Consolas" w:eastAsia="Times New Roman" w:hAnsi="Consolas" w:cs="Times New Roman"/>
+          <w:color w:val="000000"/>
+          <w:sz w:val="21"/>
+          <w:szCs w:val="21"/>
+        </w:rPr>
+        <w:t>matrix.os</w:t>
+      </w:r>
+      <w:proofErr w:type="spellEnd"/>
+      <w:r>
+        <w:rPr>
+          <w:rFonts w:ascii="Consolas" w:eastAsia="Times New Roman" w:hAnsi="Consolas" w:cs="Times New Roman"/>
+          <w:color w:val="000000"/>
+          <w:sz w:val="21"/>
+          <w:szCs w:val="21"/>
+        </w:rPr>
+        <w:t xml:space="preserve"> }}</w:t>
+      </w:r>
+    </w:p>
+    <w:p>
+      <w:pPr>
+        <w:shd w:val="clear" w:color="auto" w:fill="FFFFFF"/>
+        <w:suppressAutoHyphens w:val="0"/>
+        <w:spacing w:line="285" w:lineRule="atLeast"/>
+        <w:rPr>
+          <w:rFonts w:ascii="Consolas" w:eastAsia="Times New Roman" w:hAnsi="Consolas" w:cs="Times New Roman"/>
+          <w:color w:val="000000"/>
+          <w:sz w:val="21"/>
+          <w:szCs w:val="21"/>
+        </w:rPr>
+      </w:pPr>
+    </w:p>
+    <w:p>
+      <w:pPr>
+        <w:shd w:val="clear" w:color="auto" w:fill="FFFFFF"/>
+        <w:suppressAutoHyphens w:val="0"/>
+        <w:spacing w:line="285" w:lineRule="atLeast"/>
+        <w:rPr>
+          <w:rFonts w:ascii="Consolas" w:eastAsia="Times New Roman" w:hAnsi="Consolas" w:cs="Times New Roman"/>
+          <w:color w:val="000000"/>
+          <w:sz w:val="21"/>
+          <w:szCs w:val="21"/>
+        </w:rPr>
+      </w:pPr>
+      <w:r>
+        <w:rPr>
+          <w:rFonts w:ascii="Consolas" w:eastAsia="Times New Roman" w:hAnsi="Consolas" w:cs="Times New Roman"/>
+          <w:color w:val="000000"/>
+          <w:sz w:val="21"/>
+          <w:szCs w:val="21"/>
+        </w:rPr>
+        <w:t xml:space="preserve">    </w:t>
+      </w:r>
+      <w:r>
+        <w:rPr>
+          <w:rFonts w:ascii="Consolas" w:eastAsia="Times New Roman" w:hAnsi="Consolas" w:cs="Times New Roman"/>
+          <w:color w:val="800000"/>
+          <w:sz w:val="21"/>
+          <w:szCs w:val="21"/>
+        </w:rPr>
+        <w:t>strategy</w:t>
+      </w:r>
+      <w:r>
+        <w:rPr>
+          <w:rFonts w:ascii="Consolas" w:eastAsia="Times New Roman" w:hAnsi="Consolas" w:cs="Times New Roman"/>
+          <w:color w:val="000000"/>
+          <w:sz w:val="21"/>
+          <w:szCs w:val="21"/>
+        </w:rPr>
+        <w:t>:</w:t>
+      </w:r>
+    </w:p>
+    <w:p>
+      <w:pPr>
+        <w:shd w:val="clear" w:color="auto" w:fill="FFFFFF"/>
+        <w:suppressAutoHyphens w:val="0"/>
+        <w:spacing w:line="285" w:lineRule="atLeast"/>
+        <w:rPr>
+          <w:rFonts w:ascii="Consolas" w:eastAsia="Times New Roman" w:hAnsi="Consolas" w:cs="Times New Roman"/>
+          <w:color w:val="000000"/>
+          <w:sz w:val="21"/>
+          <w:szCs w:val="21"/>
+        </w:rPr>
+      </w:pPr>
+      <w:r>
+        <w:rPr>
+          <w:rFonts w:ascii="Consolas" w:eastAsia="Times New Roman" w:hAnsi="Consolas" w:cs="Times New Roman"/>
+          <w:color w:val="000000"/>
+          <w:sz w:val="21"/>
+          <w:szCs w:val="21"/>
+        </w:rPr>
+        <w:t xml:space="preserve">      </w:t>
+      </w:r>
+      <w:r>
+        <w:rPr>
+          <w:rFonts w:ascii="Consolas" w:eastAsia="Times New Roman" w:hAnsi="Consolas" w:cs="Times New Roman"/>
+          <w:color w:val="800000"/>
+          <w:sz w:val="21"/>
+          <w:szCs w:val="21"/>
+        </w:rPr>
+        <w:t>matrix</w:t>
+      </w:r>
+      <w:r>
+        <w:rPr>
+          <w:rFonts w:ascii="Consolas" w:eastAsia="Times New Roman" w:hAnsi="Consolas" w:cs="Times New Roman"/>
+          <w:color w:val="000000"/>
+          <w:sz w:val="21"/>
+          <w:szCs w:val="21"/>
+        </w:rPr>
+        <w:t>:</w:t>
+      </w:r>
+    </w:p>
+    <w:p>
+      <w:pPr>
+        <w:shd w:val="clear" w:color="auto" w:fill="FFFFFF"/>
+        <w:suppressAutoHyphens w:val="0"/>
+        <w:spacing w:line="285" w:lineRule="atLeast"/>
+        <w:rPr>
+          <w:rFonts w:ascii="Consolas" w:eastAsia="Times New Roman" w:hAnsi="Consolas" w:cs="Times New Roman"/>
+          <w:color w:val="000000"/>
+          <w:sz w:val="21"/>
+          <w:szCs w:val="21"/>
+        </w:rPr>
+      </w:pPr>
+      <w:r>
+        <w:rPr>
+          <w:rFonts w:ascii="Consolas" w:eastAsia="Times New Roman" w:hAnsi="Consolas" w:cs="Times New Roman"/>
+          <w:color w:val="000000"/>
+          <w:sz w:val="21"/>
+          <w:szCs w:val="21"/>
+        </w:rPr>
+        <w:t xml:space="preserve">        </w:t>
+      </w:r>
+      <w:proofErr w:type="spellStart"/>
+      <w:r>
+        <w:rPr>
+          <w:rFonts w:ascii="Consolas" w:eastAsia="Times New Roman" w:hAnsi="Consolas" w:cs="Times New Roman"/>
+          <w:color w:val="800000"/>
+          <w:sz w:val="21"/>
+          <w:szCs w:val="21"/>
+        </w:rPr>
+        <w:t>os</w:t>
+      </w:r>
+      <w:proofErr w:type="spellEnd"/>
+      <w:r>
+        <w:rPr>
+          <w:rFonts w:ascii="Consolas" w:eastAsia="Times New Roman" w:hAnsi="Consolas" w:cs="Times New Roman"/>
+          <w:color w:val="000000"/>
+          <w:sz w:val="21"/>
+          <w:szCs w:val="21"/>
+        </w:rPr>
+        <w:t xml:space="preserve">: [ </w:t>
+      </w:r>
+      <w:r>
+        <w:rPr>
+          <w:rFonts w:ascii="Consolas" w:eastAsia="Times New Roman" w:hAnsi="Consolas" w:cs="Times New Roman"/>
+          <w:color w:val="0000FF"/>
+          <w:sz w:val="21"/>
+          <w:szCs w:val="21"/>
+        </w:rPr>
+        <w:t>ubuntu-latest</w:t>
+      </w:r>
+      <w:r>
+        <w:rPr>
+          <w:rFonts w:ascii="Consolas" w:eastAsia="Times New Roman" w:hAnsi="Consolas" w:cs="Times New Roman"/>
+          <w:color w:val="000000"/>
+          <w:sz w:val="21"/>
+          <w:szCs w:val="21"/>
+        </w:rPr>
+        <w:t xml:space="preserve">, </w:t>
+      </w:r>
+      <w:r>
+        <w:rPr>
+          <w:rFonts w:ascii="Consolas" w:eastAsia="Times New Roman" w:hAnsi="Consolas" w:cs="Times New Roman"/>
+          <w:color w:val="0000FF"/>
+          <w:sz w:val="21"/>
+          <w:szCs w:val="21"/>
+        </w:rPr>
+        <w:t>windows-latest</w:t>
+      </w:r>
+      <w:r>
+        <w:rPr>
+          <w:rFonts w:ascii="Consolas" w:eastAsia="Times New Roman" w:hAnsi="Consolas" w:cs="Times New Roman"/>
+          <w:color w:val="000000"/>
+          <w:sz w:val="21"/>
+          <w:szCs w:val="21"/>
+        </w:rPr>
+        <w:t xml:space="preserve">, </w:t>
+      </w:r>
+      <w:proofErr w:type="spellStart"/>
+      <w:r>
+        <w:rPr>
+          <w:rFonts w:ascii="Consolas" w:eastAsia="Times New Roman" w:hAnsi="Consolas" w:cs="Times New Roman"/>
+          <w:color w:val="0000FF"/>
+          <w:sz w:val="21"/>
+          <w:szCs w:val="21"/>
+        </w:rPr>
+        <w:t>macos</w:t>
+      </w:r>
+      <w:proofErr w:type="spellEnd"/>
+      <w:r>
+        <w:rPr>
+          <w:rFonts w:ascii="Consolas" w:eastAsia="Times New Roman" w:hAnsi="Consolas" w:cs="Times New Roman"/>
+          <w:color w:val="0000FF"/>
+          <w:sz w:val="21"/>
+          <w:szCs w:val="21"/>
+        </w:rPr>
+        <w:t>-latest</w:t>
+      </w:r>
+      <w:r>
+        <w:rPr>
+          <w:rFonts w:ascii="Consolas" w:eastAsia="Times New Roman" w:hAnsi="Consolas" w:cs="Times New Roman"/>
+          <w:color w:val="000000"/>
+          <w:sz w:val="21"/>
+          <w:szCs w:val="21"/>
+        </w:rPr>
+        <w:t xml:space="preserve"> ]</w:t>
+      </w:r>
+    </w:p>
+    <w:p>
+      <w:pPr>
+        <w:shd w:val="clear" w:color="auto" w:fill="FFFFFF"/>
+        <w:suppressAutoHyphens w:val="0"/>
+        <w:spacing w:line="285" w:lineRule="atLeast"/>
+        <w:rPr>
+          <w:rFonts w:ascii="Consolas" w:eastAsia="Times New Roman" w:hAnsi="Consolas" w:cs="Times New Roman"/>
+          <w:color w:val="000000"/>
+          <w:sz w:val="21"/>
+          <w:szCs w:val="21"/>
+        </w:rPr>
+      </w:pPr>
+    </w:p>
+    <w:p>
+      <w:pPr>
+        <w:shd w:val="clear" w:color="auto" w:fill="FFFFFF"/>
+        <w:suppressAutoHyphens w:val="0"/>
+        <w:spacing w:line="285" w:lineRule="atLeast"/>
+        <w:rPr>
+          <w:rFonts w:ascii="Consolas" w:eastAsia="Times New Roman" w:hAnsi="Consolas" w:cs="Times New Roman"/>
+          <w:color w:val="000000"/>
+          <w:sz w:val="21"/>
+          <w:szCs w:val="21"/>
+        </w:rPr>
+      </w:pPr>
+      <w:r>
+        <w:rPr>
+          <w:rFonts w:ascii="Consolas" w:eastAsia="Times New Roman" w:hAnsi="Consolas" w:cs="Times New Roman"/>
+          <w:color w:val="000000"/>
+          <w:sz w:val="21"/>
+          <w:szCs w:val="21"/>
+        </w:rPr>
+        <w:t xml:space="preserve">    </w:t>
+      </w:r>
+      <w:r>
+        <w:rPr>
+          <w:rFonts w:ascii="Consolas" w:eastAsia="Times New Roman" w:hAnsi="Consolas" w:cs="Times New Roman"/>
+          <w:color w:val="800000"/>
+          <w:sz w:val="21"/>
+          <w:szCs w:val="21"/>
+        </w:rPr>
+        <w:t>steps</w:t>
+      </w:r>
+      <w:r>
+        <w:rPr>
+          <w:rFonts w:ascii="Consolas" w:eastAsia="Times New Roman" w:hAnsi="Consolas" w:cs="Times New Roman"/>
+          <w:color w:val="000000"/>
+          <w:sz w:val="21"/>
+          <w:szCs w:val="21"/>
+        </w:rPr>
+        <w:t>:</w:t>
+      </w:r>
+    </w:p>
+    <w:p>
+      <w:pPr>
+        <w:shd w:val="clear" w:color="auto" w:fill="FFFFFF"/>
+        <w:suppressAutoHyphens w:val="0"/>
+        <w:spacing w:line="285" w:lineRule="atLeast"/>
+        <w:rPr>
+          <w:rFonts w:ascii="Consolas" w:eastAsia="Times New Roman" w:hAnsi="Consolas" w:cs="Times New Roman"/>
+          <w:color w:val="000000"/>
+          <w:sz w:val="21"/>
+          <w:szCs w:val="21"/>
+        </w:rPr>
+      </w:pPr>
+      <w:r>
+        <w:rPr>
+          <w:rFonts w:ascii="Consolas" w:eastAsia="Times New Roman" w:hAnsi="Consolas" w:cs="Times New Roman"/>
+          <w:color w:val="000000"/>
+          <w:sz w:val="21"/>
+          <w:szCs w:val="21"/>
+        </w:rPr>
+        <w:t xml:space="preserve">      - </w:t>
+      </w:r>
+      <w:r>
+        <w:rPr>
+          <w:rFonts w:ascii="Consolas" w:eastAsia="Times New Roman" w:hAnsi="Consolas" w:cs="Times New Roman"/>
+          <w:color w:val="800000"/>
+          <w:sz w:val="21"/>
+          <w:szCs w:val="21"/>
+        </w:rPr>
+        <w:t>name</w:t>
+      </w:r>
+      <w:r>
+        <w:rPr>
+          <w:rFonts w:ascii="Consolas" w:eastAsia="Times New Roman" w:hAnsi="Consolas" w:cs="Times New Roman"/>
+          <w:color w:val="000000"/>
+          <w:sz w:val="21"/>
+          <w:szCs w:val="21"/>
+        </w:rPr>
+        <w:t xml:space="preserve">: </w:t>
+      </w:r>
+      <w:r>
+        <w:rPr>
+          <w:rFonts w:ascii="Consolas" w:eastAsia="Times New Roman" w:hAnsi="Consolas" w:cs="Times New Roman"/>
+          <w:color w:val="0000FF"/>
+          <w:sz w:val="21"/>
+          <w:szCs w:val="21"/>
+        </w:rPr>
+        <w:t>Checkout code</w:t>
+      </w:r>
+    </w:p>
+    <w:p>
+      <w:pPr>
+        <w:shd w:val="clear" w:color="auto" w:fill="FFFFFF"/>
+        <w:suppressAutoHyphens w:val="0"/>
+        <w:spacing w:line="285" w:lineRule="atLeast"/>
+        <w:rPr>
+          <w:rFonts w:ascii="Consolas" w:eastAsia="Times New Roman" w:hAnsi="Consolas" w:cs="Times New Roman"/>
+          <w:color w:val="000000"/>
+          <w:sz w:val="21"/>
+          <w:szCs w:val="21"/>
+        </w:rPr>
+      </w:pPr>
+      <w:r>
+        <w:rPr>
+          <w:rFonts w:ascii="Consolas" w:eastAsia="Times New Roman" w:hAnsi="Consolas" w:cs="Times New Roman"/>
+          <w:color w:val="000000"/>
+          <w:sz w:val="21"/>
+          <w:szCs w:val="21"/>
+        </w:rPr>
+        <w:t xml:space="preserve">        </w:t>
+      </w:r>
+      <w:r>
+        <w:rPr>
+          <w:rFonts w:ascii="Consolas" w:eastAsia="Times New Roman" w:hAnsi="Consolas" w:cs="Times New Roman"/>
+          <w:color w:val="800000"/>
+          <w:sz w:val="21"/>
+          <w:szCs w:val="21"/>
+        </w:rPr>
+        <w:t>uses</w:t>
+      </w:r>
+      <w:r>
+        <w:rPr>
+          <w:rFonts w:ascii="Consolas" w:eastAsia="Times New Roman" w:hAnsi="Consolas" w:cs="Times New Roman"/>
+          <w:color w:val="000000"/>
+          <w:sz w:val="21"/>
+          <w:szCs w:val="21"/>
+        </w:rPr>
+        <w:t xml:space="preserve">: </w:t>
+      </w:r>
+      <w:r>
+        <w:rPr>
+          <w:rFonts w:ascii="Consolas" w:eastAsia="Times New Roman" w:hAnsi="Consolas" w:cs="Times New Roman"/>
+          <w:color w:val="0000FF"/>
+          <w:sz w:val="21"/>
+          <w:szCs w:val="21"/>
+        </w:rPr>
+        <w:t>actions/checkout@v4</w:t>
+      </w:r>
+    </w:p>
+    <w:p>
+      <w:pPr>
+        <w:shd w:val="clear" w:color="auto" w:fill="FFFFFF"/>
+        <w:suppressAutoHyphens w:val="0"/>
+        <w:spacing w:line="285" w:lineRule="atLeast"/>
+        <w:rPr>
+          <w:rFonts w:ascii="Consolas" w:eastAsia="Times New Roman" w:hAnsi="Consolas" w:cs="Times New Roman"/>
+          <w:color w:val="000000"/>
+          <w:sz w:val="21"/>
+          <w:szCs w:val="21"/>
+        </w:rPr>
+      </w:pPr>
+    </w:p>
+    <w:p>
+      <w:pPr>
+        <w:shd w:val="clear" w:color="auto" w:fill="FFFFFF"/>
+        <w:suppressAutoHyphens w:val="0"/>
+        <w:spacing w:line="285" w:lineRule="atLeast"/>
+        <w:rPr>
+          <w:rFonts w:ascii="Consolas" w:eastAsia="Times New Roman" w:hAnsi="Consolas" w:cs="Times New Roman"/>
+          <w:color w:val="000000"/>
+          <w:sz w:val="21"/>
+          <w:szCs w:val="21"/>
+        </w:rPr>
+      </w:pPr>
+      <w:r>
+        <w:rPr>
+          <w:rFonts w:ascii="Consolas" w:eastAsia="Times New Roman" w:hAnsi="Consolas" w:cs="Times New Roman"/>
+          <w:color w:val="000000"/>
+          <w:sz w:val="21"/>
+          <w:szCs w:val="21"/>
+        </w:rPr>
+        <w:t xml:space="preserve">      - </w:t>
+      </w:r>
+      <w:r>
+        <w:rPr>
+          <w:rFonts w:ascii="Consolas" w:eastAsia="Times New Roman" w:hAnsi="Consolas" w:cs="Times New Roman"/>
+          <w:color w:val="800000"/>
+          <w:sz w:val="21"/>
+          <w:szCs w:val="21"/>
+        </w:rPr>
+        <w:t>name</w:t>
+      </w:r>
+      <w:r>
+        <w:rPr>
+          <w:rFonts w:ascii="Consolas" w:eastAsia="Times New Roman" w:hAnsi="Consolas" w:cs="Times New Roman"/>
+          <w:color w:val="000000"/>
+          <w:sz w:val="21"/>
+          <w:szCs w:val="21"/>
+        </w:rPr>
+        <w:t xml:space="preserve">: </w:t>
+      </w:r>
+      <w:r>
+        <w:rPr>
+          <w:rFonts w:ascii="Consolas" w:eastAsia="Times New Roman" w:hAnsi="Consolas" w:cs="Times New Roman"/>
+          <w:color w:val="0000FF"/>
+          <w:sz w:val="21"/>
+          <w:szCs w:val="21"/>
+        </w:rPr>
+        <w:t>Setup .NET</w:t>
+      </w:r>
+    </w:p>
+    <w:p>
+      <w:pPr>
+        <w:shd w:val="clear" w:color="auto" w:fill="FFFFFF"/>
+        <w:suppressAutoHyphens w:val="0"/>
+        <w:spacing w:line="285" w:lineRule="atLeast"/>
+        <w:rPr>
+          <w:rFonts w:ascii="Consolas" w:eastAsia="Times New Roman" w:hAnsi="Consolas" w:cs="Times New Roman"/>
+          <w:color w:val="000000"/>
+          <w:sz w:val="21"/>
+          <w:szCs w:val="21"/>
+        </w:rPr>
+      </w:pPr>
+      <w:r>
+        <w:rPr>
+          <w:rFonts w:ascii="Consolas" w:eastAsia="Times New Roman" w:hAnsi="Consolas" w:cs="Times New Roman"/>
+          <w:color w:val="000000"/>
+          <w:sz w:val="21"/>
+          <w:szCs w:val="21"/>
+        </w:rPr>
+        <w:t xml:space="preserve">        </w:t>
+      </w:r>
+      <w:r>
+        <w:rPr>
+          <w:rFonts w:ascii="Consolas" w:eastAsia="Times New Roman" w:hAnsi="Consolas" w:cs="Times New Roman"/>
+          <w:color w:val="800000"/>
+          <w:sz w:val="21"/>
+          <w:szCs w:val="21"/>
+        </w:rPr>
+        <w:t>uses</w:t>
+      </w:r>
+      <w:r>
+        <w:rPr>
+          <w:rFonts w:ascii="Consolas" w:eastAsia="Times New Roman" w:hAnsi="Consolas" w:cs="Times New Roman"/>
+          <w:color w:val="000000"/>
+          <w:sz w:val="21"/>
+          <w:szCs w:val="21"/>
+        </w:rPr>
+        <w:t xml:space="preserve">: </w:t>
+      </w:r>
+      <w:r>
+        <w:rPr>
+          <w:rFonts w:ascii="Consolas" w:eastAsia="Times New Roman" w:hAnsi="Consolas" w:cs="Times New Roman"/>
+          <w:color w:val="0000FF"/>
+          <w:sz w:val="21"/>
+          <w:szCs w:val="21"/>
+        </w:rPr>
+        <w:t>actions/setup-dotnet@v4</w:t>
+      </w:r>
+    </w:p>
+    <w:p>
+      <w:pPr>
+        <w:shd w:val="clear" w:color="auto" w:fill="FFFFFF"/>
+        <w:suppressAutoHyphens w:val="0"/>
+        <w:spacing w:line="285" w:lineRule="atLeast"/>
+        <w:rPr>
+          <w:rFonts w:ascii="Consolas" w:eastAsia="Times New Roman" w:hAnsi="Consolas" w:cs="Times New Roman"/>
+          <w:color w:val="000000"/>
+          <w:sz w:val="21"/>
+          <w:szCs w:val="21"/>
+        </w:rPr>
+      </w:pPr>
+      <w:r>
+        <w:rPr>
+          <w:rFonts w:ascii="Consolas" w:eastAsia="Times New Roman" w:hAnsi="Consolas" w:cs="Times New Roman"/>
+          <w:color w:val="000000"/>
+          <w:sz w:val="21"/>
+          <w:szCs w:val="21"/>
+        </w:rPr>
+        <w:t xml:space="preserve">        </w:t>
+      </w:r>
+      <w:r>
+        <w:rPr>
+          <w:rFonts w:ascii="Consolas" w:eastAsia="Times New Roman" w:hAnsi="Consolas" w:cs="Times New Roman"/>
+          <w:color w:val="800000"/>
+          <w:sz w:val="21"/>
+          <w:szCs w:val="21"/>
+        </w:rPr>
+        <w:t>with</w:t>
+      </w:r>
+      <w:r>
+        <w:rPr>
+          <w:rFonts w:ascii="Consolas" w:eastAsia="Times New Roman" w:hAnsi="Consolas" w:cs="Times New Roman"/>
+          <w:color w:val="000000"/>
+          <w:sz w:val="21"/>
+          <w:szCs w:val="21"/>
+        </w:rPr>
+        <w:t>:</w:t>
+      </w:r>
+    </w:p>
+    <w:p>
+      <w:pPr>
+        <w:shd w:val="clear" w:color="auto" w:fill="FFFFFF"/>
+        <w:suppressAutoHyphens w:val="0"/>
+        <w:spacing w:line="285" w:lineRule="atLeast"/>
+        <w:rPr>
+          <w:rFonts w:ascii="Consolas" w:eastAsia="Times New Roman" w:hAnsi="Consolas" w:cs="Times New Roman"/>
+          <w:color w:val="000000"/>
+          <w:sz w:val="21"/>
+          <w:szCs w:val="21"/>
+        </w:rPr>
+      </w:pPr>
+      <w:r>
+        <w:rPr>
+          <w:rFonts w:ascii="Consolas" w:eastAsia="Times New Roman" w:hAnsi="Consolas" w:cs="Times New Roman"/>
+          <w:color w:val="000000"/>
+          <w:sz w:val="21"/>
+          <w:szCs w:val="21"/>
+        </w:rPr>
+        <w:t xml:space="preserve">          </w:t>
+      </w:r>
+      <w:r>
+        <w:rPr>
+          <w:rFonts w:ascii="Consolas" w:eastAsia="Times New Roman" w:hAnsi="Consolas" w:cs="Times New Roman"/>
+          <w:color w:val="800000"/>
+          <w:sz w:val="21"/>
+          <w:szCs w:val="21"/>
+        </w:rPr>
+        <w:t>dotnet-version</w:t>
+      </w:r>
+      <w:r>
+        <w:rPr>
+          <w:rFonts w:ascii="Consolas" w:eastAsia="Times New Roman" w:hAnsi="Consolas" w:cs="Times New Roman"/>
+          <w:color w:val="000000"/>
+          <w:sz w:val="21"/>
+          <w:szCs w:val="21"/>
+        </w:rPr>
+        <w:t xml:space="preserve">: </w:t>
+      </w:r>
+      <w:r>
+        <w:rPr>
+          <w:rFonts w:ascii="Consolas" w:eastAsia="Times New Roman" w:hAnsi="Consolas" w:cs="Times New Roman"/>
+          <w:color w:val="A31515"/>
+          <w:sz w:val="21"/>
+          <w:szCs w:val="21"/>
+        </w:rPr>
+        <w:t>"9.0.x"</w:t>
+      </w:r>
+    </w:p>
+    <w:p>
+      <w:pPr>
+        <w:shd w:val="clear" w:color="auto" w:fill="FFFFFF"/>
+        <w:suppressAutoHyphens w:val="0"/>
+        <w:spacing w:line="285" w:lineRule="atLeast"/>
+        <w:rPr>
+          <w:rFonts w:ascii="Consolas" w:eastAsia="Times New Roman" w:hAnsi="Consolas" w:cs="Times New Roman"/>
+          <w:color w:val="000000"/>
+          <w:sz w:val="21"/>
+          <w:szCs w:val="21"/>
+        </w:rPr>
+      </w:pPr>
+    </w:p>
+    <w:p>
+      <w:pPr>
+        <w:shd w:val="clear" w:color="auto" w:fill="FFFFFF"/>
+        <w:suppressAutoHyphens w:val="0"/>
+        <w:spacing w:line="285" w:lineRule="atLeast"/>
+        <w:rPr>
+          <w:rFonts w:ascii="Consolas" w:eastAsia="Times New Roman" w:hAnsi="Consolas" w:cs="Times New Roman"/>
+          <w:color w:val="000000"/>
+          <w:sz w:val="21"/>
+          <w:szCs w:val="21"/>
+        </w:rPr>
+      </w:pPr>
+      <w:r>
+        <w:rPr>
+          <w:rFonts w:ascii="Consolas" w:eastAsia="Times New Roman" w:hAnsi="Consolas" w:cs="Times New Roman"/>
+          <w:color w:val="000000"/>
+          <w:sz w:val="21"/>
+          <w:szCs w:val="21"/>
+        </w:rPr>
+        <w:t xml:space="preserve">      - </w:t>
+      </w:r>
+      <w:r>
+        <w:rPr>
+          <w:rFonts w:ascii="Consolas" w:eastAsia="Times New Roman" w:hAnsi="Consolas" w:cs="Times New Roman"/>
+          <w:color w:val="800000"/>
+          <w:sz w:val="21"/>
+          <w:szCs w:val="21"/>
+        </w:rPr>
+        <w:t>name</w:t>
+      </w:r>
+      <w:r>
+        <w:rPr>
+          <w:rFonts w:ascii="Consolas" w:eastAsia="Times New Roman" w:hAnsi="Consolas" w:cs="Times New Roman"/>
+          <w:color w:val="000000"/>
+          <w:sz w:val="21"/>
+          <w:szCs w:val="21"/>
+        </w:rPr>
+        <w:t xml:space="preserve">: </w:t>
+      </w:r>
+      <w:r>
+        <w:rPr>
+          <w:rFonts w:ascii="Consolas" w:eastAsia="Times New Roman" w:hAnsi="Consolas" w:cs="Times New Roman"/>
+          <w:color w:val="0000FF"/>
+          <w:sz w:val="21"/>
+          <w:szCs w:val="21"/>
+        </w:rPr>
+        <w:t>Restore dependencies</w:t>
+      </w:r>
+    </w:p>
+    <w:p>
+      <w:pPr>
+        <w:shd w:val="clear" w:color="auto" w:fill="FFFFFF"/>
+        <w:suppressAutoHyphens w:val="0"/>
+        <w:spacing w:line="285" w:lineRule="atLeast"/>
+        <w:rPr>
+          <w:rFonts w:ascii="Consolas" w:eastAsia="Times New Roman" w:hAnsi="Consolas" w:cs="Times New Roman"/>
+          <w:color w:val="000000"/>
+          <w:sz w:val="21"/>
+          <w:szCs w:val="21"/>
+        </w:rPr>
+      </w:pPr>
+      <w:r>
+        <w:rPr>
+          <w:rFonts w:ascii="Consolas" w:eastAsia="Times New Roman" w:hAnsi="Consolas" w:cs="Times New Roman"/>
+          <w:color w:val="000000"/>
+          <w:sz w:val="21"/>
+          <w:szCs w:val="21"/>
+        </w:rPr>
+        <w:t xml:space="preserve">        </w:t>
+      </w:r>
+      <w:r>
+        <w:rPr>
+          <w:rFonts w:ascii="Consolas" w:eastAsia="Times New Roman" w:hAnsi="Consolas" w:cs="Times New Roman"/>
+          <w:color w:val="800000"/>
+          <w:sz w:val="21"/>
+          <w:szCs w:val="21"/>
+        </w:rPr>
+        <w:t>run</w:t>
+      </w:r>
+      <w:r>
+        <w:rPr>
+          <w:rFonts w:ascii="Consolas" w:eastAsia="Times New Roman" w:hAnsi="Consolas" w:cs="Times New Roman"/>
+          <w:color w:val="000000"/>
+          <w:sz w:val="21"/>
+          <w:szCs w:val="21"/>
+        </w:rPr>
+        <w:t xml:space="preserve">: </w:t>
+      </w:r>
+      <w:r>
+        <w:rPr>
+          <w:rFonts w:ascii="Consolas" w:eastAsia="Times New Roman" w:hAnsi="Consolas" w:cs="Times New Roman"/>
+          <w:color w:val="0000FF"/>
+          <w:sz w:val="21"/>
+          <w:szCs w:val="21"/>
+        </w:rPr>
+        <w:t>dotnet restore</w:t>
+      </w:r>
+    </w:p>
+    <w:p>
+      <w:pPr>
+        <w:shd w:val="clear" w:color="auto" w:fill="FFFFFF"/>
+        <w:suppressAutoHyphens w:val="0"/>
+        <w:spacing w:line="285" w:lineRule="atLeast"/>
+        <w:rPr>
+          <w:rFonts w:ascii="Consolas" w:eastAsia="Times New Roman" w:hAnsi="Consolas" w:cs="Times New Roman"/>
+          <w:color w:val="000000"/>
+          <w:sz w:val="21"/>
+          <w:szCs w:val="21"/>
+        </w:rPr>
+      </w:pPr>
+    </w:p>
+    <w:p>
+      <w:pPr>
+        <w:shd w:val="clear" w:color="auto" w:fill="FFFFFF"/>
+        <w:suppressAutoHyphens w:val="0"/>
+        <w:spacing w:line="285" w:lineRule="atLeast"/>
+        <w:rPr>
+          <w:rFonts w:ascii="Consolas" w:eastAsia="Times New Roman" w:hAnsi="Consolas" w:cs="Times New Roman"/>
+          <w:color w:val="000000"/>
+          <w:sz w:val="21"/>
+          <w:szCs w:val="21"/>
+        </w:rPr>
+      </w:pPr>
+      <w:r>
+        <w:rPr>
+          <w:rFonts w:ascii="Consolas" w:eastAsia="Times New Roman" w:hAnsi="Consolas" w:cs="Times New Roman"/>
+          <w:color w:val="000000"/>
+          <w:sz w:val="21"/>
+          <w:szCs w:val="21"/>
+        </w:rPr>
+        <w:t xml:space="preserve">      - </w:t>
+      </w:r>
+      <w:r>
+        <w:rPr>
+          <w:rFonts w:ascii="Consolas" w:eastAsia="Times New Roman" w:hAnsi="Consolas" w:cs="Times New Roman"/>
+          <w:color w:val="800000"/>
+          <w:sz w:val="21"/>
+          <w:szCs w:val="21"/>
+        </w:rPr>
+        <w:t>name</w:t>
+      </w:r>
+      <w:r>
+        <w:rPr>
+          <w:rFonts w:ascii="Consolas" w:eastAsia="Times New Roman" w:hAnsi="Consolas" w:cs="Times New Roman"/>
+          <w:color w:val="000000"/>
+          <w:sz w:val="21"/>
+          <w:szCs w:val="21"/>
+        </w:rPr>
+        <w:t xml:space="preserve">: </w:t>
+      </w:r>
+      <w:r>
+        <w:rPr>
+          <w:rFonts w:ascii="Consolas" w:eastAsia="Times New Roman" w:hAnsi="Consolas" w:cs="Times New Roman"/>
+          <w:color w:val="0000FF"/>
+          <w:sz w:val="21"/>
+          <w:szCs w:val="21"/>
+        </w:rPr>
+        <w:t>Build</w:t>
+      </w:r>
+    </w:p>
+    <w:p>
+      <w:pPr>
+        <w:shd w:val="clear" w:color="auto" w:fill="FFFFFF"/>
+        <w:suppressAutoHyphens w:val="0"/>
+        <w:spacing w:line="285" w:lineRule="atLeast"/>
+        <w:rPr>
+          <w:rFonts w:ascii="Consolas" w:eastAsia="Times New Roman" w:hAnsi="Consolas" w:cs="Times New Roman"/>
+          <w:color w:val="000000"/>
+          <w:sz w:val="21"/>
+          <w:szCs w:val="21"/>
+        </w:rPr>
+      </w:pPr>
+      <w:r>
+        <w:rPr>
+          <w:rFonts w:ascii="Consolas" w:eastAsia="Times New Roman" w:hAnsi="Consolas" w:cs="Times New Roman"/>
+          <w:color w:val="000000"/>
+          <w:sz w:val="21"/>
+          <w:szCs w:val="21"/>
+        </w:rPr>
+        <w:t xml:space="preserve">        </w:t>
+      </w:r>
+      <w:r>
+        <w:rPr>
+          <w:rFonts w:ascii="Consolas" w:eastAsia="Times New Roman" w:hAnsi="Consolas" w:cs="Times New Roman"/>
+          <w:color w:val="800000"/>
+          <w:sz w:val="21"/>
+          <w:szCs w:val="21"/>
+        </w:rPr>
+        <w:t>run</w:t>
+      </w:r>
+      <w:r>
+        <w:rPr>
+          <w:rFonts w:ascii="Consolas" w:eastAsia="Times New Roman" w:hAnsi="Consolas" w:cs="Times New Roman"/>
+          <w:color w:val="000000"/>
+          <w:sz w:val="21"/>
+          <w:szCs w:val="21"/>
+        </w:rPr>
+        <w:t xml:space="preserve">: </w:t>
+      </w:r>
+      <w:r>
+        <w:rPr>
+          <w:rFonts w:ascii="Consolas" w:eastAsia="Times New Roman" w:hAnsi="Consolas" w:cs="Times New Roman"/>
+          <w:color w:val="0000FF"/>
+          <w:sz w:val="21"/>
+          <w:szCs w:val="21"/>
+        </w:rPr>
+        <w:t>dotnet build --no-restore --configuration Release</w:t>
+      </w:r>
+    </w:p>
+    <w:p>
+      <w:pPr>
+        <w:shd w:val="clear" w:color="auto" w:fill="FFFFFF"/>
+        <w:suppressAutoHyphens w:val="0"/>
+        <w:spacing w:line="285" w:lineRule="atLeast"/>
+        <w:rPr>
+          <w:rFonts w:ascii="Consolas" w:eastAsia="Times New Roman" w:hAnsi="Consolas" w:cs="Times New Roman"/>
+          <w:color w:val="000000"/>
+          <w:sz w:val="21"/>
+          <w:szCs w:val="21"/>
+        </w:rPr>
+      </w:pPr>
+    </w:p>
+    <w:p>
+      <w:pPr>
+        <w:shd w:val="clear" w:color="auto" w:fill="FFFFFF"/>
+        <w:suppressAutoHyphens w:val="0"/>
+        <w:spacing w:line="285" w:lineRule="atLeast"/>
+        <w:rPr>
+          <w:rFonts w:ascii="Consolas" w:eastAsia="Times New Roman" w:hAnsi="Consolas" w:cs="Times New Roman"/>
+          <w:color w:val="000000"/>
+          <w:sz w:val="21"/>
+          <w:szCs w:val="21"/>
+        </w:rPr>
+      </w:pPr>
+      <w:r>
+        <w:rPr>
+          <w:rFonts w:ascii="Consolas" w:eastAsia="Times New Roman" w:hAnsi="Consolas" w:cs="Times New Roman"/>
+          <w:color w:val="000000"/>
+          <w:sz w:val="21"/>
+          <w:szCs w:val="21"/>
+        </w:rPr>
+        <w:lastRenderedPageBreak/>
+        <w:t xml:space="preserve">      - </w:t>
+      </w:r>
+      <w:r>
+        <w:rPr>
+          <w:rFonts w:ascii="Consolas" w:eastAsia="Times New Roman" w:hAnsi="Consolas" w:cs="Times New Roman"/>
+          <w:color w:val="800000"/>
+          <w:sz w:val="21"/>
+          <w:szCs w:val="21"/>
+        </w:rPr>
+        <w:t>name</w:t>
+      </w:r>
+      <w:r>
+        <w:rPr>
+          <w:rFonts w:ascii="Consolas" w:eastAsia="Times New Roman" w:hAnsi="Consolas" w:cs="Times New Roman"/>
+          <w:color w:val="000000"/>
+          <w:sz w:val="21"/>
+          <w:szCs w:val="21"/>
+        </w:rPr>
+        <w:t xml:space="preserve">: </w:t>
+      </w:r>
+      <w:r>
+        <w:rPr>
+          <w:rFonts w:ascii="Consolas" w:eastAsia="Times New Roman" w:hAnsi="Consolas" w:cs="Times New Roman"/>
+          <w:color w:val="0000FF"/>
+          <w:sz w:val="21"/>
+          <w:szCs w:val="21"/>
+        </w:rPr>
+        <w:t>Test</w:t>
+      </w:r>
+    </w:p>
+    <w:p>
+      <w:pPr>
+        <w:shd w:val="clear" w:color="auto" w:fill="FFFFFF"/>
+        <w:suppressAutoHyphens w:val="0"/>
+        <w:spacing w:line="285" w:lineRule="atLeast"/>
+        <w:rPr>
+          <w:rFonts w:ascii="Consolas" w:eastAsia="Times New Roman" w:hAnsi="Consolas" w:cs="Times New Roman"/>
+          <w:color w:val="000000"/>
+          <w:sz w:val="21"/>
+          <w:szCs w:val="21"/>
+        </w:rPr>
+      </w:pPr>
+      <w:r>
+        <w:rPr>
+          <w:rFonts w:ascii="Consolas" w:eastAsia="Times New Roman" w:hAnsi="Consolas" w:cs="Times New Roman"/>
+          <w:color w:val="000000"/>
+          <w:sz w:val="21"/>
+          <w:szCs w:val="21"/>
+        </w:rPr>
+        <w:t xml:space="preserve">        </w:t>
+      </w:r>
+      <w:r>
+        <w:rPr>
+          <w:rFonts w:ascii="Consolas" w:eastAsia="Times New Roman" w:hAnsi="Consolas" w:cs="Times New Roman"/>
+          <w:color w:val="800000"/>
+          <w:sz w:val="21"/>
+          <w:szCs w:val="21"/>
+        </w:rPr>
+        <w:t>run</w:t>
+      </w:r>
+      <w:r>
+        <w:rPr>
+          <w:rFonts w:ascii="Consolas" w:eastAsia="Times New Roman" w:hAnsi="Consolas" w:cs="Times New Roman"/>
+          <w:color w:val="000000"/>
+          <w:sz w:val="21"/>
+          <w:szCs w:val="21"/>
+        </w:rPr>
+        <w:t xml:space="preserve">: </w:t>
+      </w:r>
+      <w:r>
+        <w:rPr>
+          <w:rFonts w:ascii="Consolas" w:eastAsia="Times New Roman" w:hAnsi="Consolas" w:cs="Times New Roman"/>
+          <w:color w:val="0000FF"/>
+          <w:sz w:val="21"/>
+          <w:szCs w:val="21"/>
+        </w:rPr>
+        <w:t>dotnet test --no-build --verbosity normal</w:t>
+      </w:r>
+    </w:p>
+    <w:p>
+      <w:pPr>
+        <w:shd w:val="clear" w:color="auto" w:fill="FFFFFF"/>
+        <w:suppressAutoHyphens w:val="0"/>
+        <w:spacing w:line="285" w:lineRule="atLeast"/>
+        <w:rPr>
+          <w:rFonts w:ascii="Consolas" w:eastAsia="Times New Roman" w:hAnsi="Consolas" w:cs="Times New Roman"/>
+          <w:color w:val="000000"/>
+          <w:sz w:val="21"/>
+          <w:szCs w:val="21"/>
         </w:rPr>
       </w:pPr>
     </w:p>
@@ -13652,12 +15151,100 @@
     </w:p>
     <w:p/>
     <w:p>
-      <w:r>
-        <w:t>This makes the build status visible to anyone viewing the repo.</w:t>
+      <w:pPr>
+        <w:rPr>
+          <w:i/>
+          <w:iCs/>
+        </w:rPr>
+      </w:pPr>
+      <w:r>
+        <w:t>This makes the build status visible to anyone viewing the repo</w:t>
+      </w:r>
+      <w:r>
+        <w:t xml:space="preserve"> indicating:</w:t>
       </w:r>
       <w:r>
         <w:br/>
       </w:r>
+      <w:r>
+        <w:br/>
+      </w:r>
+      <w:r>
+        <w:rPr>
+          <w:i/>
+          <w:iCs/>
+        </w:rPr>
+        <w:t>This project is called Subscription Metrics and here is a live build status indicator for the CI pipeline.</w:t>
+      </w:r>
+    </w:p>
+    <w:p>
+      <w:pPr>
+        <w:rPr>
+          <w:i/>
+          <w:iCs/>
+        </w:rPr>
+      </w:pPr>
+      <w:r>
+        <w:rPr>
+          <w:i/>
+          <w:iCs/>
+        </w:rPr>
+        <w:t>If the build is green, the badge is green.</w:t>
+      </w:r>
+      <w:r>
+        <w:rPr>
+          <w:i/>
+          <w:iCs/>
+        </w:rPr>
+        <w:br/>
+        <w:t>If the build is failing, the badge turns red.</w:t>
+      </w:r>
+    </w:p>
+    <w:p>
+      <w:pPr>
+        <w:rPr>
+          <w:i/>
+          <w:iCs/>
+        </w:rPr>
+      </w:pPr>
+    </w:p>
+    <w:p>
+      <w:pPr>
+        <w:rPr>
+          <w:sz w:val="20"/>
+          <w:szCs w:val="20"/>
+        </w:rPr>
+      </w:pPr>
+      <w:r>
+        <w:rPr>
+          <w:sz w:val="20"/>
+          <w:szCs w:val="20"/>
+        </w:rPr>
+        <w:t xml:space="preserve">The SVG part is what a </w:t>
+      </w:r>
+      <w:r>
+        <w:rPr>
+          <w:sz w:val="20"/>
+          <w:szCs w:val="20"/>
+        </w:rPr>
+        <w:t>GitHub generate</w:t>
+      </w:r>
+      <w:r>
+        <w:rPr>
+          <w:sz w:val="20"/>
+          <w:szCs w:val="20"/>
+        </w:rPr>
+        <w:t xml:space="preserve">d image </w:t>
+      </w:r>
+      <w:r>
+        <w:rPr>
+          <w:sz w:val="20"/>
+          <w:szCs w:val="20"/>
+        </w:rPr>
+        <w:t>that reflects the current status of your workflow</w:t>
+      </w:r>
+    </w:p>
+    <w:p>
       <w:r>
         <w:br/>
       </w:r>
@@ -13751,7 +15338,52 @@
         <w:t xml:space="preserve"> branch from regressions</w:t>
       </w:r>
     </w:p>
-    <w:p/>
+    <w:p>
+      <w:r>
+        <w:br/>
+        <w:t>Here is an example  screenshot</w:t>
+      </w:r>
+      <w:r>
+        <w:br/>
+      </w:r>
+      <w:r>
+        <w:drawing>
+          <wp:inline distT="0" distB="0" distL="0" distR="0" wp14:anchorId="44909217" wp14:editId="64E9EF16">
+            <wp:extent cx="2207602" cy="1978175"/>
+            <wp:effectExtent l="0" t="0" r="2540" b="3175"/>
+            <wp:docPr id="272626558" name="Picture 1" descr="A screenshot of a computer program&#10;&#10;AI-generated content may be incorrect."/>
+            <wp:cNvGraphicFramePr>
+              <a:graphicFrameLocks xmlns:a="http://schemas.openxmlformats.org/drawingml/2006/main" noChangeAspect="1"/>
+            </wp:cNvGraphicFramePr>
+            <a:graphic xmlns:a="http://schemas.openxmlformats.org/drawingml/2006/main">
+              <a:graphicData uri="http://schemas.openxmlformats.org/drawingml/2006/picture">
+                <pic:pic xmlns:pic="http://schemas.openxmlformats.org/drawingml/2006/picture">
+                  <pic:nvPicPr>
+                    <pic:cNvPr id="272626558" name="Picture 1" descr="A screenshot of a computer program&#10;&#10;AI-generated content may be incorrect."/>
+                    <pic:cNvPicPr/>
+                  </pic:nvPicPr>
+                  <pic:blipFill>
+                    <a:blip r:embed="rId5"/>
+                    <a:stretch>
+                      <a:fillRect/>
+                    </a:stretch>
+                  </pic:blipFill>
+                  <pic:spPr>
+                    <a:xfrm>
+                      <a:off x="0" y="0"/>
+                      <a:ext cx="2218363" cy="1987817"/>
+                    </a:xfrm>
+                    <a:prstGeom prst="rect">
+                      <a:avLst/>
+                    </a:prstGeom>
+                  </pic:spPr>
+                </pic:pic>
+              </a:graphicData>
+            </a:graphic>
+          </wp:inline>
+        </w:drawing>
+      </w:r>
+    </w:p>
     <w:p>
       <w:pPr>
         <w:rPr>
@@ -16733,6 +18365,19 @@
       <w:spacing w:val="5"/>
     </w:rPr>
   </w:style>
+  <w:style w:type="paragraph" w:styleId="NormalWeb">
+    <w:name w:val="Normal (Web)"/>
+    <w:basedOn w:val="Normal"/>
+    <w:uiPriority w:val="99"/>
+    <w:semiHidden/>
+    <w:unhideWhenUsed/>
+    <w:rsid w:val="00A42FD9"/>
+    <w:rPr>
+      <w:rFonts w:ascii="Times New Roman" w:hAnsi="Times New Roman" w:cs="Times New Roman"/>
+      <w:sz w:val="24"/>
+      <w:szCs w:val="24"/>
+    </w:rPr>
+  </w:style>
 </w:styles>
 </file>
 

</xml_diff>